<commit_message>
BRD: 6-week timeline to Ready for Pilot/UAT 20/11/2026
Co-Authored-By: Claude Opus 5.5 <noreply@anthropic.com>
</commit_message>
<xml_diff>
--- a/docs/DAIT-BRD- Dự án AI Data Room v1.0 - 07.10.2026.docx
+++ b/docs/DAIT-BRD- Dự án AI Data Room v1.0 - 07.10.2026.docx
@@ -511,7 +511,7 @@
                 <w:lang w:val="vi-VN"/>
                 <w14:ligatures w14:val="none"/>
               </w:rPr>
-              <w:t xml:space="preserve">Go-live Bản 1 ngày 26/02/2027</w:t>
+              <w:t xml:space="preserve">Ready for Pilot/UAT ngày 20/11/2026</w:t>
             </w:r>
             <w:r>
               <w:rPr>
@@ -1082,7 +1082,7 @@
           <w:color w:val="000000" w:themeColor="text1" w:themeTint="FF" w:themeShade="FF"/>
           <w:lang w:val="en-US"/>
         </w:rPr>
-        <w:t>Phạm vi Out-of-scope: Không xây Data Room, trình xem, watermark hay chức năng cấp quyền (thuộc SharePoint, Entra, Purview do Chủ Data Room và Quản trị tenant thực hiện). Không lưu file gốc on-prem. Câu hỏi đếm/tổng và kho bản ghi thuộc Bản 2, chờ đánh giá sau Go-live.</w:t>
+        <w:t>Phạm vi Out-of-scope: Không xây Data Room, trình xem, watermark hay chức năng cấp quyền (thuộc SharePoint, Entra, Purview do Chủ Data Room và Quản trị tenant thực hiện). Không lưu file gốc on-prem. Mở cho nhà đầu tư (Go-live) sau khi Pilot/UAT đạt các cổng; câu hỏi đếm/tổng thuộc Bản 2.</w:t>
       </w:r>
     </w:p>
     <w:p xmlns:wp14="http://schemas.microsoft.com/office/word/2010/wordml" wp14:textId="77777777" wp14:noSpellErr="1">
@@ -4588,7 +4588,7 @@
                 <w:kern w:val="0"/>
                 <w14:ligatures w14:val="none"/>
               </w:rPr>
-              <w:t>Trước 16/10/2026 (Dùng cho 9 phép thử tích hợp; OTP trước 31/10/2026)</w:t>
+              <w:t>Trước 14/10/2026 (Dùng cho 9 phép thử tích hợp; OTP trước 31/10/2026)</w:t>
             </w:r>
             <w:r>
               <w:rPr>
@@ -4660,7 +4660,7 @@
                 <w:color w:val="000000" w:themeColor="text1" w:themeTint="FF" w:themeShade="FF"/>
                 <w:lang w:val="en-US"/>
               </w:rPr>
-              <w:t>Bộ câu hỏi chuẩn có đáp án (150 câu phát triển + ≥ 500 câu giữ riêng) và 300 trang scan mẫu kèm 1.000 ô số chép lại.</w:t>
+              <w:t>Tối thiểu 100 câu hỏi mẫu có đáp án và 50 trang scan mẫu (dấu đỏ, bảng, chữ ký) kèm con số chép lại.</w:t>
             </w:r>
           </w:p>
         </w:tc>
@@ -4716,7 +4716,7 @@
                 <w:kern w:val="0"/>
                 <w14:ligatures w14:val="none"/>
               </w:rPr>
-              <w:t>Trước 23/10/2026 (Dùng để Test &amp; Tinh chỉnh độ chính xác)</w:t>
+              <w:t>Trước 16/10/2026 (Dùng để Test &amp; Tinh chỉnh độ chính xác)</w:t>
             </w:r>
             <w:r>
               <w:rPr>
@@ -4977,7 +4977,7 @@
                 <w:lang w:val="en-US"/>
                 <w14:ligatures w14:val="none"/>
               </w:rPr>
-              <w:t>Nhà đầu tư hỏi bộ câu chuẩn (≥ 500 câu).</w:t>
+              <w:t>Hỏi bộ câu chuẩn trên site thử (≥ 100 câu).</w:t>
             </w:r>
           </w:p>
         </w:tc>
@@ -5425,7 +5425,7 @@
           <w:lang w:val="en-US"/>
           <w14:ligatures w14:val="none"/>
         </w:rPr>
-        <w:t>Dự án được phân bổ nguồn lực (đội 4–5 người) để Go-live Bản 1 trước ngày 26/02/2027.</w:t>
+        <w:t>Dự án được phân bổ nguồn lực để hoàn thiện và nghiệm thu (UAT) trước ngày 20/11/2026.</w:t>
       </w:r>
       <w:r>
         <w:rPr>
@@ -5934,7 +5934,7 @@
                 <w:kern w:val="0"/>
                 <w14:ligatures w14:val="none"/>
               </w:rPr>
-              <w:t>23/10/2026</w:t>
+              <w:t>16/10/2026</w:t>
             </w:r>
             <w:r>
               <w:rPr>
@@ -5993,7 +5993,7 @@
                 <w:szCs w:val="24"/>
                 <w:lang w:val="en-US"/>
               </w:rPr>
-              <w:t>9 phép thử tích hợp M365</w:t>
+              <w:t>Baseline nghiệp vụ &amp; PoC</w:t>
             </w:r>
           </w:p>
         </w:tc>
@@ -6033,7 +6033,7 @@
                 <w:szCs w:val="24"/>
                 <w:lang w:val="en-US"/>
               </w:rPr>
-              <w:t>BOD chốt ngân sách GPU; cổng đi tiếp/dừng, phép thử 3 thất bại → chế độ dự phòng.</w:t>
+              <w:t>Chủ Data Room xác nhận Business Rule; có site thử, khách thử; chạy 9 phép thử tích hợp M365.</w:t>
             </w:r>
           </w:p>
         </w:tc>
@@ -6066,7 +6066,7 @@
                 <w:kern w:val="0"/>
                 <w14:ligatures w14:val="none"/>
               </w:rPr>
-              <w:t>30/10/2026</w:t>
+              <w:t>23/10/2026</w:t>
             </w:r>
           </w:p>
         </w:tc>
@@ -6095,7 +6095,7 @@
                 <w:lang w:val="en-US"/>
                 <w14:ligatures w14:val="none"/>
               </w:rPr>
-              <w:t>PoC độ chính xác &amp; Cổng BOD</w:t>
+              <w:t>Tích hợp Luồng Lõi</w:t>
             </w:r>
           </w:p>
         </w:tc>
@@ -6124,7 +6124,7 @@
                 <w:lang w:val="en-US"/>
                 <w14:ligatures w14:val="none"/>
               </w:rPr>
-              <w:t>So sánh LLM, OCR, chọn cấu hình GPU; hạn chuyển OTP sang B2B 31/10/2026.</w:t>
+              <w:t>Kết nối Graph thật (delta, quyền, kiểm tra trực tiếp) thay tenant giả lập; nạp tài liệu site thử.</w:t>
             </w:r>
           </w:p>
         </w:tc>
@@ -6158,7 +6158,7 @@
                 <w:kern w:val="0"/>
                 <w14:ligatures w14:val="none"/>
               </w:rPr>
-              <w:t>04/12/2026</w:t>
+              <w:t>30/10/2026</w:t>
             </w:r>
           </w:p>
         </w:tc>
@@ -6187,7 +6187,7 @@
                 <w:lang w:val="en-US"/>
                 <w14:ligatures w14:val="none"/>
               </w:rPr>
-              <w:t>Nạp tài liệu &amp; Quyền</w:t>
+              <w:t>Demo Lần 1</w:t>
             </w:r>
           </w:p>
         </w:tc>
@@ -6216,7 +6216,7 @@
                 <w:lang w:val="en-US"/>
                 <w14:ligatures w14:val="none"/>
               </w:rPr>
-              <w:t xml:space="preserve">Connector, bản chép quyền, tập thu hồi, nạp tài liệu, chỉ mục phân vùng.</w:t>
+              <w:t xml:space="preserve">Demo trên site thử cho Chủ Data Room/BOD để lấy feedback; hạn chuyển OTP sang B2B 31/10.</w:t>
             </w:r>
             <w:r>
               <w:rPr>
@@ -6426,7 +6426,7 @@
                 <w:kern w:val="0"/>
                 <w14:ligatures w14:val="none"/>
               </w:rPr>
-              <w:t>08/01/2027</w:t>
+              <w:t>13/11/2026</w:t>
             </w:r>
           </w:p>
         </w:tc>
@@ -6455,7 +6455,7 @@
                 <w:lang w:val="en-US"/>
                 <w14:ligatures w14:val="none"/>
               </w:rPr>
-              <w:t>Luồng truy vấn</w:t>
+              <w:t>Hoàn thiện Toàn bộ Tính năng</w:t>
             </w:r>
           </w:p>
         </w:tc>
@@ -6482,7 +6482,7 @@
                 <w:color w:val="000000" w:themeColor="text1" w:themeTint="FF" w:themeShade="FF"/>
                 <w:lang w:val="en-US"/>
               </w:rPr>
-              <w:t xml:space="preserve">Gateway, kiểm tra trực tiếp, giao diện qua DMZ, kiểm chứng, nhật ký.</w:t>
+              <w:t xml:space="preserve">Đăng nhập Entra, giao diện, kiểm chứng, nhật ký, dashboard, bộ lọc bảo mật; đo trên bộ câu chuẩn.</w:t>
             </w:r>
             <w:r>
               <w:rPr>
@@ -6708,7 +6708,7 @@
                 <w:kern w:val="0"/>
                 <w14:ligatures w14:val="none"/>
               </w:rPr>
-              <w:t>05/02/2027</w:t>
+              <w:t>18/11/2026</w:t>
             </w:r>
             <w:r>
               <w:rPr>
@@ -6780,7 +6780,7 @@
                 <w:lang w:val="en-US"/>
                 <w14:ligatures w14:val="none"/>
               </w:rPr>
-              <w:t>Ma trận rò rỉ, red-team, pentest độc lập, sửa và kiểm lại (lưu ý Tết ~06/02/2027).</w:t>
+              <w:t>QA nội bộ, ma trận rò rỉ, red-team, quét lỗ hổng.</w:t>
             </w:r>
           </w:p>
         </w:tc>
@@ -6814,7 +6814,7 @@
                 <w:kern w:val="0"/>
                 <w14:ligatures w14:val="none"/>
               </w:rPr>
-              <w:t>26/02/2027</w:t>
+              <w:t>20/11/2026</w:t>
             </w:r>
             <w:r>
               <w:rPr>
@@ -6861,7 +6861,7 @@
                 <w:u w:val="none"/>
                 <w:lang w:val="vi-VN"/>
               </w:rPr>
-              <w:t>Go-live Bản 1</w:t>
+              <w:t>Ready for Pilot / UAT</w:t>
             </w:r>
           </w:p>
         </w:tc>
@@ -6880,7 +6880,7 @@
                 <w:color w:val="000000" w:themeColor="text1" w:themeTint="FF" w:themeShade="FF"/>
                 <w:lang w:val="en-US"/>
               </w:rPr>
-              <w:t>Thử nội bộ 15–19/02 → Go-live → Hypercare đến 26/03/2027.</w:t>
+              <w:t>Pilot nội bộ (nhân viên, cố vấn) → UAT → Fix → Sign-off trước khi mở cho nhà đầu tư.</w:t>
             </w:r>
           </w:p>
         </w:tc>

</xml_diff>

<commit_message>
BRD: section 9 (references) left empty
Co-Authored-By: Claude Opus 5.5 <noreply@anthropic.com>
</commit_message>
<xml_diff>
--- a/docs/DAIT-BRD- Dự án AI Data Room v1.0 - 07.10.2026.docx
+++ b/docs/DAIT-BRD- Dự án AI Data Room v1.0 - 07.10.2026.docx
@@ -11782,117 +11782,6 @@
           <w:color w:val="000000" w:themeColor="text1" w:themeTint="FF" w:themeShade="FF"/>
         </w:rPr>
         <w:t>TÀI LIỆU THAM KHẢO CHÍNH</w:t>
-      </w:r>
-    </w:p>
-    <w:p>
-      <w:pPr>
-        <w:spacing w:beforeAutospacing="on" w:afterAutospacing="on"/>
-        <w:rPr>
-          <w:rFonts w:ascii="Times New Roman" w:hAnsi="Times New Roman" w:eastAsia="Times New Roman" w:cs="Times New Roman"/>
-          <w:color w:val="000000" w:themeColor="text1" w:themeTint="FF" w:themeShade="FF"/>
-          <w:lang w:val="en-US"/>
-        </w:rPr>
-      </w:pPr>
-      <w:r>
-        <w:rPr>
-          <w:rFonts w:ascii="Times New Roman" w:hAnsi="Times New Roman" w:eastAsia="Times New Roman" w:cs="Times New Roman"/>
-          <w:color w:val="000000" w:themeColor="text1" w:themeTint="FF" w:themeShade="FF"/>
-          <w:lang w:val="en-US"/>
-        </w:rPr>
-        <w:t>• Kế hoạch tổng: AI core cho Data Room trên SharePoint (IPO), v0.6 – 07/10/2026.</w:t>
-      </w:r>
-    </w:p>
-    <w:p xmlns:wp14="http://schemas.microsoft.com/office/word/2010/wordml" wp14:textId="19B9F746">
-      <w:pPr>
-        <w:spacing w:beforeAutospacing="on" w:afterAutospacing="on"/>
-      </w:pPr>
-      <w:r>
-        <w:rPr>
-          <w:rFonts w:ascii="Times New Roman" w:hAnsi="Times New Roman" w:eastAsia="Times New Roman" w:cs="Times New Roman"/>
-          <w:color w:val="000000" w:themeColor="text1" w:themeTint="FF" w:themeShade="FF"/>
-          <w:lang w:val="en-US"/>
-        </w:rPr>
-        <w:t xml:space="preserve">• Kế hoạch bảo mật AI Data Room (tham khảo) và số đo bản demo ngày 07/10/2026.</w:t>
-      </w:r>
-      <w:r>
-        <w:rPr>
-          <w:rFonts w:ascii="Times New Roman" w:hAnsi="Times New Roman" w:eastAsia="Times New Roman" w:cs="Times New Roman"/>
-          <w:color w:val="000000" w:themeColor="text1" w:themeTint="FF" w:themeShade="FF"/>
-          <w:lang w:val="en-US"/>
-        </w:rPr>
-        <w:t/>
-      </w:r>
-      <w:r>
-        <w:rPr>
-          <w:rFonts w:ascii="Times New Roman" w:hAnsi="Times New Roman" w:eastAsia="Times New Roman" w:cs="Times New Roman"/>
-          <w:color w:val="000000" w:themeColor="text1" w:themeTint="FF" w:themeShade="FF"/>
-          <w:lang w:val="en-US"/>
-        </w:rPr>
-        <w:t xml:space="preserve"/>
-      </w:r>
-      <w:r>
-        <w:rPr>
-          <w:rFonts w:ascii="Times New Roman" w:hAnsi="Times New Roman" w:eastAsia="Times New Roman" w:cs="Times New Roman"/>
-          <w:color w:val="000000" w:themeColor="text1" w:themeTint="FF" w:themeShade="FF"/>
-          <w:lang w:val="en-US"/>
-        </w:rPr>
-        <w:t/>
-      </w:r>
-      <w:r>
-        <w:rPr>
-          <w:rFonts w:ascii="Times New Roman" w:hAnsi="Times New Roman" w:eastAsia="Times New Roman" w:cs="Times New Roman"/>
-          <w:color w:val="000000" w:themeColor="text1" w:themeTint="FF" w:themeShade="FF"/>
-          <w:lang w:val="en-US"/>
-        </w:rPr>
-        <w:t xml:space="preserve"/>
-      </w:r>
-      <w:r>
-        <w:rPr>
-          <w:rFonts w:ascii="Times New Roman" w:hAnsi="Times New Roman" w:eastAsia="Times New Roman" w:cs="Times New Roman"/>
-          <w:color w:val="000000" w:themeColor="text1" w:themeTint="FF" w:themeShade="FF"/>
-          <w:lang w:val="en-US"/>
-        </w:rPr>
-        <w:t/>
-      </w:r>
-      <w:r>
-        <w:rPr>
-          <w:rFonts w:ascii="Times New Roman" w:hAnsi="Times New Roman" w:eastAsia="Times New Roman" w:cs="Times New Roman"/>
-          <w:color w:val="000000" w:themeColor="text1" w:themeTint="FF" w:themeShade="FF"/>
-          <w:lang w:val="en-US"/>
-        </w:rPr>
-        <w:t xml:space="preserve"/>
-      </w:r>
-      <w:r>
-        <w:rPr>
-          <w:rFonts w:ascii="Times New Roman" w:hAnsi="Times New Roman" w:eastAsia="Times New Roman" w:cs="Times New Roman"/>
-          <w:color w:val="000000" w:themeColor="text1" w:themeTint="FF" w:themeShade="FF"/>
-          <w:lang w:val="en-US"/>
-        </w:rPr>
-        <w:t/>
-      </w:r>
-      <w:r>
-        <w:rPr>
-          <w:rFonts w:ascii="Times New Roman" w:hAnsi="Times New Roman" w:eastAsia="Times New Roman" w:cs="Times New Roman"/>
-          <w:color w:val="000000" w:themeColor="text1" w:themeTint="FF" w:themeShade="FF"/>
-          <w:lang w:val="en-US"/>
-        </w:rPr>
-        <w:t xml:space="preserve"/>
-      </w:r>
-      <w:r>
-        <w:rPr>
-          <w:rFonts w:ascii="Times New Roman" w:hAnsi="Times New Roman" w:eastAsia="Times New Roman" w:cs="Times New Roman"/>
-          <w:color w:val="000000" w:themeColor="text1" w:themeTint="FF" w:themeShade="FF"/>
-          <w:lang w:val="en-US"/>
-        </w:rPr>
-        <w:t/>
-      </w:r>
-      <w:r>
-        <w:rPr>
-          <w:rFonts w:ascii="Times New Roman" w:hAnsi="Times New Roman" w:eastAsia="Times New Roman" w:cs="Times New Roman"/>
-          <w:color w:val="000000" w:themeColor="text1" w:themeTint="FF" w:themeShade="FF"/>
-          <w:lang w:val="en-US"/>
-        </w:rPr>
-        <w:t xml:space="preserve"/>
       </w:r>
     </w:p>
     <w:sectPr>

</xml_diff>